<commit_message>
Added screenshots to readme
</commit_message>
<xml_diff>
--- a/Documentation/AnalyseRapport/AnalyseRapport_v2.docx
+++ b/Documentation/AnalyseRapport/AnalyseRapport_v2.docx
@@ -12275,11 +12275,12 @@
           <w:pPr>
             <w:pStyle w:val="TOC1"/>
             <w:tabs>
-              <w:tab w:val="left" w:pos="480"/>
+              <w:tab w:val="left" w:pos="720"/>
               <w:tab w:val="right" w:leader="dot" w:pos="9016"/>
             </w:tabs>
             <w:rPr>
               <w:rFonts w:asciiTheme="minorHAnsi" w:eastAsiaTheme="minorEastAsia" w:hAnsiTheme="minorHAnsi" w:cstheme="minorBidi"/>
+              <w:noProof/>
               <w:sz w:val="24"/>
               <w:lang w:val="en-BE" w:eastAsia="en-BE"/>
             </w:rPr>
@@ -12293,16 +12294,18 @@
           <w:r>
             <w:fldChar w:fldCharType="separate"/>
           </w:r>
-          <w:hyperlink w:anchor="_Toc211097593" w:history="1">
+          <w:hyperlink w:anchor="_Toc231746409" w:history="1">
             <w:r>
               <w:rPr>
                 <w:rStyle w:val="Hyperlink"/>
+                <w:noProof/>
               </w:rPr>
               <w:t>1.</w:t>
             </w:r>
             <w:r>
               <w:rPr>
                 <w:rFonts w:asciiTheme="minorHAnsi" w:eastAsiaTheme="minorEastAsia" w:hAnsiTheme="minorHAnsi" w:cstheme="minorBidi"/>
+                <w:noProof/>
                 <w:sz w:val="24"/>
                 <w:lang w:val="en-BE" w:eastAsia="en-BE"/>
               </w:rPr>
@@ -12311,46 +12314,54 @@
             <w:r>
               <w:rPr>
                 <w:rStyle w:val="Hyperlink"/>
+                <w:noProof/>
               </w:rPr>
               <w:t>Opdrachtbeschrijving</w:t>
             </w:r>
             <w:r>
               <w:rPr>
+                <w:noProof/>
                 <w:webHidden/>
               </w:rPr>
               <w:tab/>
             </w:r>
             <w:r>
               <w:rPr>
+                <w:noProof/>
                 <w:webHidden/>
               </w:rPr>
               <w:fldChar w:fldCharType="begin"/>
             </w:r>
             <w:r>
               <w:rPr>
+                <w:noProof/>
                 <w:webHidden/>
               </w:rPr>
-              <w:instrText xml:space="preserve"> PAGEREF _Toc211097593 \h </w:instrText>
+              <w:instrText xml:space="preserve"> PAGEREF _Toc231746409 \h </w:instrText>
             </w:r>
             <w:r>
               <w:rPr>
+                <w:noProof/>
                 <w:webHidden/>
               </w:rPr>
             </w:r>
             <w:r>
               <w:rPr>
+                <w:noProof/>
                 <w:webHidden/>
               </w:rPr>
               <w:fldChar w:fldCharType="separate"/>
             </w:r>
             <w:r>
               <w:rPr>
+                <w:noProof/>
                 <w:webHidden/>
               </w:rPr>
               <w:t>2</w:t>
             </w:r>
             <w:r>
               <w:rPr>
+                <w:noProof/>
                 <w:webHidden/>
               </w:rPr>
               <w:fldChar w:fldCharType="end"/>
@@ -12364,60 +12375,81 @@
               <w:tab w:val="left" w:pos="960"/>
               <w:tab w:val="right" w:leader="dot" w:pos="9016"/>
             </w:tabs>
+            <w:rPr>
+              <w:rFonts w:asciiTheme="minorHAnsi" w:eastAsiaTheme="minorEastAsia" w:hAnsiTheme="minorHAnsi" w:cstheme="minorBidi"/>
+              <w:noProof/>
+              <w:sz w:val="24"/>
+              <w:lang w:val="en-BE" w:eastAsia="en-BE"/>
+            </w:rPr>
           </w:pPr>
-          <w:hyperlink w:anchor="_Toc211097594" w:history="1">
+          <w:hyperlink w:anchor="_Toc231746410" w:history="1">
             <w:r>
               <w:rPr>
                 <w:rStyle w:val="Hyperlink"/>
+                <w:noProof/>
               </w:rPr>
               <w:t>1.1.</w:t>
             </w:r>
             <w:r>
+              <w:rPr>
+                <w:rFonts w:asciiTheme="minorHAnsi" w:eastAsiaTheme="minorEastAsia" w:hAnsiTheme="minorHAnsi" w:cstheme="minorBidi"/>
+                <w:noProof/>
+                <w:sz w:val="24"/>
+                <w:lang w:val="en-BE" w:eastAsia="en-BE"/>
+              </w:rPr>
               <w:tab/>
             </w:r>
             <w:r>
               <w:rPr>
                 <w:rStyle w:val="Hyperlink"/>
+                <w:noProof/>
               </w:rPr>
               <w:t>Horeca app</w:t>
             </w:r>
             <w:r>
               <w:rPr>
+                <w:noProof/>
                 <w:webHidden/>
               </w:rPr>
               <w:tab/>
             </w:r>
             <w:r>
               <w:rPr>
+                <w:noProof/>
                 <w:webHidden/>
               </w:rPr>
               <w:fldChar w:fldCharType="begin"/>
             </w:r>
             <w:r>
               <w:rPr>
+                <w:noProof/>
                 <w:webHidden/>
               </w:rPr>
-              <w:instrText xml:space="preserve"> PAGEREF _Toc211097594 \h </w:instrText>
+              <w:instrText xml:space="preserve"> PAGEREF _Toc231746410 \h </w:instrText>
             </w:r>
             <w:r>
               <w:rPr>
+                <w:noProof/>
                 <w:webHidden/>
               </w:rPr>
             </w:r>
             <w:r>
               <w:rPr>
+                <w:noProof/>
                 <w:webHidden/>
               </w:rPr>
               <w:fldChar w:fldCharType="separate"/>
             </w:r>
             <w:r>
               <w:rPr>
+                <w:noProof/>
                 <w:webHidden/>
               </w:rPr>
               <w:t>2</w:t>
             </w:r>
             <w:r>
               <w:rPr>
+                <w:noProof/>
                 <w:webHidden/>
               </w:rPr>
               <w:fldChar w:fldCharType="end"/>
@@ -12428,63 +12460,84 @@
           <w:pPr>
             <w:pStyle w:val="TOC3"/>
             <w:tabs>
-              <w:tab w:val="left" w:pos="1440"/>
+              <w:tab w:val="left" w:pos="1200"/>
               <w:tab w:val="right" w:leader="dot" w:pos="9016"/>
             </w:tabs>
+            <w:rPr>
+              <w:rFonts w:asciiTheme="minorHAnsi" w:eastAsiaTheme="minorEastAsia" w:hAnsiTheme="minorHAnsi" w:cstheme="minorBidi"/>
+              <w:noProof/>
+              <w:sz w:val="24"/>
+              <w:lang w:val="en-BE" w:eastAsia="en-BE"/>
+            </w:rPr>
           </w:pPr>
-          <w:hyperlink w:anchor="_Toc211097595" w:history="1">
+          <w:hyperlink w:anchor="_Toc231746411" w:history="1">
             <w:r>
               <w:rPr>
                 <w:rStyle w:val="Hyperlink"/>
+                <w:noProof/>
               </w:rPr>
               <w:t>1.1.1.</w:t>
             </w:r>
             <w:r>
+              <w:rPr>
+                <w:rFonts w:asciiTheme="minorHAnsi" w:eastAsiaTheme="minorEastAsia" w:hAnsiTheme="minorHAnsi" w:cstheme="minorBidi"/>
+                <w:noProof/>
+                <w:sz w:val="24"/>
+                <w:lang w:val="en-BE" w:eastAsia="en-BE"/>
+              </w:rPr>
               <w:tab/>
             </w:r>
             <w:r>
               <w:rPr>
                 <w:rStyle w:val="Hyperlink"/>
+                <w:noProof/>
               </w:rPr>
               <w:t>Meer over startspeler</w:t>
             </w:r>
             <w:r>
               <w:rPr>
+                <w:noProof/>
                 <w:webHidden/>
               </w:rPr>
               <w:tab/>
             </w:r>
             <w:r>
               <w:rPr>
+                <w:noProof/>
                 <w:webHidden/>
               </w:rPr>
               <w:fldChar w:fldCharType="begin"/>
             </w:r>
             <w:r>
               <w:rPr>
+                <w:noProof/>
                 <w:webHidden/>
               </w:rPr>
-              <w:instrText xml:space="preserve"> PAGEREF _Toc211097595 \h </w:instrText>
+              <w:instrText xml:space="preserve"> PAGEREF _Toc231746411 \h </w:instrText>
             </w:r>
             <w:r>
               <w:rPr>
+                <w:noProof/>
                 <w:webHidden/>
               </w:rPr>
             </w:r>
             <w:r>
               <w:rPr>
+                <w:noProof/>
                 <w:webHidden/>
               </w:rPr>
               <w:fldChar w:fldCharType="separate"/>
             </w:r>
             <w:r>
               <w:rPr>
+                <w:noProof/>
                 <w:webHidden/>
               </w:rPr>
               <w:t>2</w:t>
             </w:r>
             <w:r>
               <w:rPr>
+                <w:noProof/>
                 <w:webHidden/>
               </w:rPr>
               <w:fldChar w:fldCharType="end"/>
@@ -12495,63 +12548,84 @@
           <w:pPr>
             <w:pStyle w:val="TOC3"/>
             <w:tabs>
-              <w:tab w:val="left" w:pos="1440"/>
+              <w:tab w:val="left" w:pos="1200"/>
               <w:tab w:val="right" w:leader="dot" w:pos="9016"/>
             </w:tabs>
+            <w:rPr>
+              <w:rFonts w:asciiTheme="minorHAnsi" w:eastAsiaTheme="minorEastAsia" w:hAnsiTheme="minorHAnsi" w:cstheme="minorBidi"/>
+              <w:noProof/>
+              <w:sz w:val="24"/>
+              <w:lang w:val="en-BE" w:eastAsia="en-BE"/>
+            </w:rPr>
           </w:pPr>
-          <w:hyperlink w:anchor="_Toc211097596" w:history="1">
+          <w:hyperlink w:anchor="_Toc231746412" w:history="1">
             <w:r>
               <w:rPr>
                 <w:rStyle w:val="Hyperlink"/>
+                <w:noProof/>
               </w:rPr>
               <w:t>1.1.2.</w:t>
             </w:r>
             <w:r>
+              <w:rPr>
+                <w:rFonts w:asciiTheme="minorHAnsi" w:eastAsiaTheme="minorEastAsia" w:hAnsiTheme="minorHAnsi" w:cstheme="minorBidi"/>
+                <w:noProof/>
+                <w:sz w:val="24"/>
+                <w:lang w:val="en-BE" w:eastAsia="en-BE"/>
+              </w:rPr>
               <w:tab/>
             </w:r>
             <w:r>
               <w:rPr>
                 <w:rStyle w:val="Hyperlink"/>
+                <w:noProof/>
               </w:rPr>
               <w:t>Huidige workflow</w:t>
             </w:r>
             <w:r>
               <w:rPr>
+                <w:noProof/>
                 <w:webHidden/>
               </w:rPr>
               <w:tab/>
             </w:r>
             <w:r>
               <w:rPr>
+                <w:noProof/>
                 <w:webHidden/>
               </w:rPr>
               <w:fldChar w:fldCharType="begin"/>
             </w:r>
             <w:r>
               <w:rPr>
+                <w:noProof/>
                 <w:webHidden/>
               </w:rPr>
-              <w:instrText xml:space="preserve"> PAGEREF _Toc211097596 \h </w:instrText>
+              <w:instrText xml:space="preserve"> PAGEREF _Toc231746412 \h </w:instrText>
             </w:r>
             <w:r>
               <w:rPr>
+                <w:noProof/>
                 <w:webHidden/>
               </w:rPr>
             </w:r>
             <w:r>
               <w:rPr>
+                <w:noProof/>
                 <w:webHidden/>
               </w:rPr>
               <w:fldChar w:fldCharType="separate"/>
             </w:r>
             <w:r>
               <w:rPr>
+                <w:noProof/>
                 <w:webHidden/>
               </w:rPr>
               <w:t>2</w:t>
             </w:r>
             <w:r>
               <w:rPr>
+                <w:noProof/>
                 <w:webHidden/>
               </w:rPr>
               <w:fldChar w:fldCharType="end"/>
@@ -12562,63 +12636,84 @@
           <w:pPr>
             <w:pStyle w:val="TOC3"/>
             <w:tabs>
-              <w:tab w:val="left" w:pos="1440"/>
+              <w:tab w:val="left" w:pos="1200"/>
               <w:tab w:val="right" w:leader="dot" w:pos="9016"/>
             </w:tabs>
+            <w:rPr>
+              <w:rFonts w:asciiTheme="minorHAnsi" w:eastAsiaTheme="minorEastAsia" w:hAnsiTheme="minorHAnsi" w:cstheme="minorBidi"/>
+              <w:noProof/>
+              <w:sz w:val="24"/>
+              <w:lang w:val="en-BE" w:eastAsia="en-BE"/>
+            </w:rPr>
           </w:pPr>
-          <w:hyperlink w:anchor="_Toc211097597" w:history="1">
+          <w:hyperlink w:anchor="_Toc231746413" w:history="1">
             <w:r>
               <w:rPr>
                 <w:rStyle w:val="Hyperlink"/>
+                <w:noProof/>
               </w:rPr>
               <w:t>1.1.3.</w:t>
             </w:r>
             <w:r>
+              <w:rPr>
+                <w:rFonts w:asciiTheme="minorHAnsi" w:eastAsiaTheme="minorEastAsia" w:hAnsiTheme="minorHAnsi" w:cstheme="minorBidi"/>
+                <w:noProof/>
+                <w:sz w:val="24"/>
+                <w:lang w:val="en-BE" w:eastAsia="en-BE"/>
+              </w:rPr>
               <w:tab/>
             </w:r>
             <w:r>
               <w:rPr>
                 <w:rStyle w:val="Hyperlink"/>
+                <w:noProof/>
               </w:rPr>
               <w:t>Gewenste workflow</w:t>
             </w:r>
             <w:r>
               <w:rPr>
+                <w:noProof/>
                 <w:webHidden/>
               </w:rPr>
               <w:tab/>
             </w:r>
             <w:r>
               <w:rPr>
+                <w:noProof/>
                 <w:webHidden/>
               </w:rPr>
               <w:fldChar w:fldCharType="begin"/>
             </w:r>
             <w:r>
               <w:rPr>
+                <w:noProof/>
                 <w:webHidden/>
               </w:rPr>
-              <w:instrText xml:space="preserve"> PAGEREF _Toc211097597 \h </w:instrText>
+              <w:instrText xml:space="preserve"> PAGEREF _Toc231746413 \h </w:instrText>
             </w:r>
             <w:r>
               <w:rPr>
+                <w:noProof/>
                 <w:webHidden/>
               </w:rPr>
             </w:r>
             <w:r>
               <w:rPr>
+                <w:noProof/>
                 <w:webHidden/>
               </w:rPr>
               <w:fldChar w:fldCharType="separate"/>
             </w:r>
             <w:r>
               <w:rPr>
+                <w:noProof/>
                 <w:webHidden/>
               </w:rPr>
               <w:t>2</w:t>
             </w:r>
             <w:r>
               <w:rPr>
+                <w:noProof/>
                 <w:webHidden/>
               </w:rPr>
               <w:fldChar w:fldCharType="end"/>
@@ -12629,63 +12724,84 @@
           <w:pPr>
             <w:pStyle w:val="TOC3"/>
             <w:tabs>
-              <w:tab w:val="left" w:pos="1440"/>
+              <w:tab w:val="left" w:pos="1200"/>
               <w:tab w:val="right" w:leader="dot" w:pos="9016"/>
             </w:tabs>
+            <w:rPr>
+              <w:rFonts w:asciiTheme="minorHAnsi" w:eastAsiaTheme="minorEastAsia" w:hAnsiTheme="minorHAnsi" w:cstheme="minorBidi"/>
+              <w:noProof/>
+              <w:sz w:val="24"/>
+              <w:lang w:val="en-BE" w:eastAsia="en-BE"/>
+            </w:rPr>
           </w:pPr>
-          <w:hyperlink w:anchor="_Toc211097598" w:history="1">
+          <w:hyperlink w:anchor="_Toc231746414" w:history="1">
             <w:r>
               <w:rPr>
                 <w:rStyle w:val="Hyperlink"/>
+                <w:noProof/>
               </w:rPr>
               <w:t>1.1.4.</w:t>
             </w:r>
             <w:r>
+              <w:rPr>
+                <w:rFonts w:asciiTheme="minorHAnsi" w:eastAsiaTheme="minorEastAsia" w:hAnsiTheme="minorHAnsi" w:cstheme="minorBidi"/>
+                <w:noProof/>
+                <w:sz w:val="24"/>
+                <w:lang w:val="en-BE" w:eastAsia="en-BE"/>
+              </w:rPr>
               <w:tab/>
             </w:r>
             <w:r>
               <w:rPr>
                 <w:rStyle w:val="Hyperlink"/>
+                <w:noProof/>
               </w:rPr>
               <w:t>Must haves</w:t>
             </w:r>
             <w:r>
               <w:rPr>
+                <w:noProof/>
                 <w:webHidden/>
               </w:rPr>
               <w:tab/>
             </w:r>
             <w:r>
               <w:rPr>
+                <w:noProof/>
                 <w:webHidden/>
               </w:rPr>
               <w:fldChar w:fldCharType="begin"/>
             </w:r>
             <w:r>
               <w:rPr>
+                <w:noProof/>
                 <w:webHidden/>
               </w:rPr>
-              <w:instrText xml:space="preserve"> PAGEREF _Toc211097598 \h </w:instrText>
+              <w:instrText xml:space="preserve"> PAGEREF _Toc231746414 \h </w:instrText>
             </w:r>
             <w:r>
               <w:rPr>
+                <w:noProof/>
                 <w:webHidden/>
               </w:rPr>
             </w:r>
             <w:r>
               <w:rPr>
+                <w:noProof/>
                 <w:webHidden/>
               </w:rPr>
               <w:fldChar w:fldCharType="separate"/>
             </w:r>
             <w:r>
               <w:rPr>
+                <w:noProof/>
                 <w:webHidden/>
               </w:rPr>
               <w:t>2</w:t>
             </w:r>
             <w:r>
               <w:rPr>
+                <w:noProof/>
                 <w:webHidden/>
               </w:rPr>
               <w:fldChar w:fldCharType="end"/>
@@ -12701,20 +12817,23 @@
             </w:tabs>
             <w:rPr>
               <w:rFonts w:asciiTheme="minorHAnsi" w:eastAsiaTheme="minorEastAsia" w:hAnsiTheme="minorHAnsi" w:cstheme="minorBidi"/>
+              <w:noProof/>
               <w:sz w:val="24"/>
               <w:lang w:val="en-BE" w:eastAsia="en-BE"/>
             </w:rPr>
           </w:pPr>
-          <w:hyperlink w:anchor="_Toc211097599" w:history="1">
+          <w:hyperlink w:anchor="_Toc231746415" w:history="1">
             <w:r>
               <w:rPr>
                 <w:rStyle w:val="Hyperlink"/>
+                <w:noProof/>
               </w:rPr>
               <w:t>2.</w:t>
             </w:r>
             <w:r>
               <w:rPr>
                 <w:rFonts w:asciiTheme="minorHAnsi" w:eastAsiaTheme="minorEastAsia" w:hAnsiTheme="minorHAnsi" w:cstheme="minorBidi"/>
+                <w:noProof/>
                 <w:sz w:val="24"/>
                 <w:lang w:val="en-BE" w:eastAsia="en-BE"/>
               </w:rPr>
@@ -12723,46 +12842,54 @@
             <w:r>
               <w:rPr>
                 <w:rStyle w:val="Hyperlink"/>
+                <w:noProof/>
               </w:rPr>
               <w:t>Eisenanalyse</w:t>
             </w:r>
             <w:r>
               <w:rPr>
+                <w:noProof/>
                 <w:webHidden/>
               </w:rPr>
               <w:tab/>
             </w:r>
             <w:r>
               <w:rPr>
+                <w:noProof/>
                 <w:webHidden/>
               </w:rPr>
               <w:fldChar w:fldCharType="begin"/>
             </w:r>
             <w:r>
               <w:rPr>
+                <w:noProof/>
                 <w:webHidden/>
               </w:rPr>
-              <w:instrText xml:space="preserve"> PAGEREF _Toc211097599 \h </w:instrText>
+              <w:instrText xml:space="preserve"> PAGEREF _Toc231746415 \h </w:instrText>
             </w:r>
             <w:r>
               <w:rPr>
+                <w:noProof/>
                 <w:webHidden/>
               </w:rPr>
             </w:r>
             <w:r>
               <w:rPr>
+                <w:noProof/>
                 <w:webHidden/>
               </w:rPr>
               <w:fldChar w:fldCharType="separate"/>
             </w:r>
             <w:r>
               <w:rPr>
+                <w:noProof/>
                 <w:webHidden/>
               </w:rPr>
               <w:t>4</w:t>
             </w:r>
             <w:r>
               <w:rPr>
+                <w:noProof/>
                 <w:webHidden/>
               </w:rPr>
               <w:fldChar w:fldCharType="end"/>
@@ -12776,60 +12903,81 @@
               <w:tab w:val="left" w:pos="960"/>
               <w:tab w:val="right" w:leader="dot" w:pos="9016"/>
             </w:tabs>
+            <w:rPr>
+              <w:rFonts w:asciiTheme="minorHAnsi" w:eastAsiaTheme="minorEastAsia" w:hAnsiTheme="minorHAnsi" w:cstheme="minorBidi"/>
+              <w:noProof/>
+              <w:sz w:val="24"/>
+              <w:lang w:val="en-BE" w:eastAsia="en-BE"/>
+            </w:rPr>
           </w:pPr>
-          <w:hyperlink w:anchor="_Toc211097600" w:history="1">
+          <w:hyperlink w:anchor="_Toc231746416" w:history="1">
             <w:r>
               <w:rPr>
                 <w:rStyle w:val="Hyperlink"/>
+                <w:noProof/>
               </w:rPr>
               <w:t>2.1.</w:t>
             </w:r>
             <w:r>
+              <w:rPr>
+                <w:rFonts w:asciiTheme="minorHAnsi" w:eastAsiaTheme="minorEastAsia" w:hAnsiTheme="minorHAnsi" w:cstheme="minorBidi"/>
+                <w:noProof/>
+                <w:sz w:val="24"/>
+                <w:lang w:val="en-BE" w:eastAsia="en-BE"/>
+              </w:rPr>
               <w:tab/>
             </w:r>
             <w:r>
               <w:rPr>
                 <w:rStyle w:val="Hyperlink"/>
+                <w:noProof/>
               </w:rPr>
               <w:t>Functionele eisen</w:t>
             </w:r>
             <w:r>
               <w:rPr>
+                <w:noProof/>
                 <w:webHidden/>
               </w:rPr>
               <w:tab/>
             </w:r>
             <w:r>
               <w:rPr>
+                <w:noProof/>
                 <w:webHidden/>
               </w:rPr>
               <w:fldChar w:fldCharType="begin"/>
             </w:r>
             <w:r>
               <w:rPr>
+                <w:noProof/>
                 <w:webHidden/>
               </w:rPr>
-              <w:instrText xml:space="preserve"> PAGEREF _Toc211097600 \h </w:instrText>
+              <w:instrText xml:space="preserve"> PAGEREF _Toc231746416 \h </w:instrText>
             </w:r>
             <w:r>
               <w:rPr>
+                <w:noProof/>
                 <w:webHidden/>
               </w:rPr>
             </w:r>
             <w:r>
               <w:rPr>
+                <w:noProof/>
                 <w:webHidden/>
               </w:rPr>
               <w:fldChar w:fldCharType="separate"/>
             </w:r>
             <w:r>
               <w:rPr>
+                <w:noProof/>
                 <w:webHidden/>
               </w:rPr>
               <w:t>4</w:t>
             </w:r>
             <w:r>
               <w:rPr>
+                <w:noProof/>
                 <w:webHidden/>
               </w:rPr>
               <w:fldChar w:fldCharType="end"/>
@@ -12840,65 +12988,86 @@
           <w:pPr>
             <w:pStyle w:val="TOC3"/>
             <w:tabs>
-              <w:tab w:val="left" w:pos="1440"/>
+              <w:tab w:val="left" w:pos="1200"/>
               <w:tab w:val="right" w:leader="dot" w:pos="9016"/>
             </w:tabs>
+            <w:rPr>
+              <w:rFonts w:asciiTheme="minorHAnsi" w:eastAsiaTheme="minorEastAsia" w:hAnsiTheme="minorHAnsi" w:cstheme="minorBidi"/>
+              <w:noProof/>
+              <w:sz w:val="24"/>
+              <w:lang w:val="en-BE" w:eastAsia="en-BE"/>
+            </w:rPr>
           </w:pPr>
-          <w:hyperlink w:anchor="_Toc211097601" w:history="1">
+          <w:hyperlink w:anchor="_Toc231746417" w:history="1">
             <w:r>
               <w:rPr>
                 <w:rStyle w:val="Hyperlink"/>
+                <w:noProof/>
                 <w:lang w:eastAsia="nl-BE"/>
               </w:rPr>
               <w:t>2.1.1.</w:t>
             </w:r>
             <w:r>
+              <w:rPr>
+                <w:rFonts w:asciiTheme="minorHAnsi" w:eastAsiaTheme="minorEastAsia" w:hAnsiTheme="minorHAnsi" w:cstheme="minorBidi"/>
+                <w:noProof/>
+                <w:sz w:val="24"/>
+                <w:lang w:val="en-BE" w:eastAsia="en-BE"/>
+              </w:rPr>
               <w:tab/>
             </w:r>
             <w:r>
               <w:rPr>
                 <w:rStyle w:val="Hyperlink"/>
+                <w:noProof/>
                 <w:lang w:eastAsia="nl-BE"/>
               </w:rPr>
               <w:t>Use Case Diagram</w:t>
             </w:r>
             <w:r>
               <w:rPr>
+                <w:noProof/>
                 <w:webHidden/>
               </w:rPr>
               <w:tab/>
             </w:r>
             <w:r>
               <w:rPr>
+                <w:noProof/>
                 <w:webHidden/>
               </w:rPr>
               <w:fldChar w:fldCharType="begin"/>
             </w:r>
             <w:r>
               <w:rPr>
+                <w:noProof/>
                 <w:webHidden/>
               </w:rPr>
-              <w:instrText xml:space="preserve"> PAGEREF _Toc211097601 \h </w:instrText>
+              <w:instrText xml:space="preserve"> PAGEREF _Toc231746417 \h </w:instrText>
             </w:r>
             <w:r>
               <w:rPr>
+                <w:noProof/>
                 <w:webHidden/>
               </w:rPr>
             </w:r>
             <w:r>
               <w:rPr>
+                <w:noProof/>
                 <w:webHidden/>
               </w:rPr>
               <w:fldChar w:fldCharType="separate"/>
             </w:r>
             <w:r>
               <w:rPr>
+                <w:noProof/>
                 <w:webHidden/>
               </w:rPr>
               <w:t>4</w:t>
             </w:r>
             <w:r>
               <w:rPr>
+                <w:noProof/>
                 <w:webHidden/>
               </w:rPr>
               <w:fldChar w:fldCharType="end"/>
@@ -12909,65 +13078,86 @@
           <w:pPr>
             <w:pStyle w:val="TOC3"/>
             <w:tabs>
-              <w:tab w:val="left" w:pos="1440"/>
+              <w:tab w:val="left" w:pos="1200"/>
               <w:tab w:val="right" w:leader="dot" w:pos="9016"/>
             </w:tabs>
+            <w:rPr>
+              <w:rFonts w:asciiTheme="minorHAnsi" w:eastAsiaTheme="minorEastAsia" w:hAnsiTheme="minorHAnsi" w:cstheme="minorBidi"/>
+              <w:noProof/>
+              <w:sz w:val="24"/>
+              <w:lang w:val="en-BE" w:eastAsia="en-BE"/>
+            </w:rPr>
           </w:pPr>
-          <w:hyperlink w:anchor="_Toc211097602" w:history="1">
+          <w:hyperlink w:anchor="_Toc231746418" w:history="1">
             <w:r>
               <w:rPr>
                 <w:rStyle w:val="Hyperlink"/>
+                <w:noProof/>
                 <w:lang w:eastAsia="nl-BE"/>
               </w:rPr>
               <w:t>2.1.2.</w:t>
             </w:r>
             <w:r>
+              <w:rPr>
+                <w:rFonts w:asciiTheme="minorHAnsi" w:eastAsiaTheme="minorEastAsia" w:hAnsiTheme="minorHAnsi" w:cstheme="minorBidi"/>
+                <w:noProof/>
+                <w:sz w:val="24"/>
+                <w:lang w:val="en-BE" w:eastAsia="en-BE"/>
+              </w:rPr>
               <w:tab/>
             </w:r>
             <w:r>
               <w:rPr>
                 <w:rStyle w:val="Hyperlink"/>
+                <w:noProof/>
                 <w:lang w:eastAsia="nl-BE"/>
               </w:rPr>
               <w:t>Datamodel</w:t>
             </w:r>
             <w:r>
               <w:rPr>
+                <w:noProof/>
                 <w:webHidden/>
               </w:rPr>
               <w:tab/>
             </w:r>
             <w:r>
               <w:rPr>
+                <w:noProof/>
                 <w:webHidden/>
               </w:rPr>
               <w:fldChar w:fldCharType="begin"/>
             </w:r>
             <w:r>
               <w:rPr>
+                <w:noProof/>
                 <w:webHidden/>
               </w:rPr>
-              <w:instrText xml:space="preserve"> PAGEREF _Toc211097602 \h </w:instrText>
+              <w:instrText xml:space="preserve"> PAGEREF _Toc231746418 \h </w:instrText>
             </w:r>
             <w:r>
               <w:rPr>
+                <w:noProof/>
                 <w:webHidden/>
               </w:rPr>
             </w:r>
             <w:r>
               <w:rPr>
+                <w:noProof/>
                 <w:webHidden/>
               </w:rPr>
               <w:fldChar w:fldCharType="separate"/>
             </w:r>
             <w:r>
               <w:rPr>
+                <w:noProof/>
                 <w:webHidden/>
               </w:rPr>
               <w:t>5</w:t>
             </w:r>
             <w:r>
               <w:rPr>
+                <w:noProof/>
                 <w:webHidden/>
               </w:rPr>
               <w:fldChar w:fldCharType="end"/>
@@ -12978,64 +13168,175 @@
           <w:pPr>
             <w:pStyle w:val="TOC3"/>
             <w:tabs>
-              <w:tab w:val="left" w:pos="1440"/>
+              <w:tab w:val="left" w:pos="1200"/>
               <w:tab w:val="right" w:leader="dot" w:pos="9016"/>
             </w:tabs>
+            <w:rPr>
+              <w:rFonts w:asciiTheme="minorHAnsi" w:eastAsiaTheme="minorEastAsia" w:hAnsiTheme="minorHAnsi" w:cstheme="minorBidi"/>
+              <w:noProof/>
+              <w:sz w:val="24"/>
+              <w:lang w:val="en-BE" w:eastAsia="en-BE"/>
+            </w:rPr>
           </w:pPr>
-          <w:hyperlink w:anchor="_Toc211097603" w:history="1">
+          <w:hyperlink w:anchor="_Toc231746419" w:history="1">
             <w:r>
               <w:rPr>
                 <w:rStyle w:val="Hyperlink"/>
+                <w:noProof/>
                 <w:lang w:eastAsia="nl-BE"/>
               </w:rPr>
               <w:t>2.1.3.</w:t>
             </w:r>
             <w:r>
+              <w:rPr>
+                <w:rFonts w:asciiTheme="minorHAnsi" w:eastAsiaTheme="minorEastAsia" w:hAnsiTheme="minorHAnsi" w:cstheme="minorBidi"/>
+                <w:noProof/>
+                <w:sz w:val="24"/>
+                <w:lang w:val="en-BE" w:eastAsia="en-BE"/>
+              </w:rPr>
               <w:tab/>
             </w:r>
             <w:r>
               <w:rPr>
                 <w:rStyle w:val="Hyperlink"/>
+                <w:noProof/>
               </w:rPr>
               <w:t>Use Case Beschrijvingen</w:t>
             </w:r>
             <w:r>
               <w:rPr>
+                <w:noProof/>
                 <w:webHidden/>
               </w:rPr>
               <w:tab/>
             </w:r>
             <w:r>
               <w:rPr>
+                <w:noProof/>
                 <w:webHidden/>
               </w:rPr>
               <w:fldChar w:fldCharType="begin"/>
             </w:r>
             <w:r>
               <w:rPr>
+                <w:noProof/>
                 <w:webHidden/>
               </w:rPr>
-              <w:instrText xml:space="preserve"> PAGEREF _Toc211097603 \h </w:instrText>
+              <w:instrText xml:space="preserve"> PAGEREF _Toc231746419 \h </w:instrText>
             </w:r>
             <w:r>
               <w:rPr>
+                <w:noProof/>
                 <w:webHidden/>
               </w:rPr>
             </w:r>
             <w:r>
               <w:rPr>
+                <w:noProof/>
                 <w:webHidden/>
               </w:rPr>
               <w:fldChar w:fldCharType="separate"/>
             </w:r>
             <w:r>
               <w:rPr>
+                <w:noProof/>
                 <w:webHidden/>
               </w:rPr>
               <w:t>6</w:t>
             </w:r>
             <w:r>
               <w:rPr>
+                <w:noProof/>
+                <w:webHidden/>
+              </w:rPr>
+              <w:fldChar w:fldCharType="end"/>
+            </w:r>
+          </w:hyperlink>
+        </w:p>
+        <w:p>
+          <w:pPr>
+            <w:pStyle w:val="TOC1"/>
+            <w:tabs>
+              <w:tab w:val="left" w:pos="720"/>
+              <w:tab w:val="right" w:leader="dot" w:pos="9016"/>
+            </w:tabs>
+            <w:rPr>
+              <w:rFonts w:asciiTheme="minorHAnsi" w:eastAsiaTheme="minorEastAsia" w:hAnsiTheme="minorHAnsi" w:cstheme="minorBidi"/>
+              <w:noProof/>
+              <w:sz w:val="24"/>
+              <w:lang w:val="en-BE" w:eastAsia="en-BE"/>
+            </w:rPr>
+          </w:pPr>
+          <w:hyperlink w:anchor="_Toc231746420" w:history="1">
+            <w:r>
+              <w:rPr>
+                <w:rStyle w:val="Hyperlink"/>
+                <w:noProof/>
+                <w:lang w:eastAsia="nl-BE"/>
+              </w:rPr>
+              <w:t>3.</w:t>
+            </w:r>
+            <w:r>
+              <w:rPr>
+                <w:rFonts w:asciiTheme="minorHAnsi" w:eastAsiaTheme="minorEastAsia" w:hAnsiTheme="minorHAnsi" w:cstheme="minorBidi"/>
+                <w:noProof/>
+                <w:sz w:val="24"/>
+                <w:lang w:val="en-BE" w:eastAsia="en-BE"/>
+              </w:rPr>
+              <w:tab/>
+            </w:r>
+            <w:r>
+              <w:rPr>
+                <w:rStyle w:val="Hyperlink"/>
+                <w:noProof/>
+                <w:lang w:eastAsia="nl-BE"/>
+              </w:rPr>
+              <w:t>Stijl prototypes</w:t>
+            </w:r>
+            <w:r>
+              <w:rPr>
+                <w:noProof/>
+                <w:webHidden/>
+              </w:rPr>
+              <w:tab/>
+            </w:r>
+            <w:r>
+              <w:rPr>
+                <w:noProof/>
+                <w:webHidden/>
+              </w:rPr>
+              <w:fldChar w:fldCharType="begin"/>
+            </w:r>
+            <w:r>
+              <w:rPr>
+                <w:noProof/>
+                <w:webHidden/>
+              </w:rPr>
+              <w:instrText xml:space="preserve"> PAGEREF _Toc231746420 \h </w:instrText>
+            </w:r>
+            <w:r>
+              <w:rPr>
+                <w:noProof/>
+                <w:webHidden/>
+              </w:rPr>
+            </w:r>
+            <w:r>
+              <w:rPr>
+                <w:noProof/>
+                <w:webHidden/>
+              </w:rPr>
+              <w:fldChar w:fldCharType="separate"/>
+            </w:r>
+            <w:r>
+              <w:rPr>
+                <w:noProof/>
+                <w:webHidden/>
+              </w:rPr>
+              <w:t>11</w:t>
+            </w:r>
+            <w:r>
+              <w:rPr>
+                <w:noProof/>
                 <w:webHidden/>
               </w:rPr>
               <w:fldChar w:fldCharType="end"/>
@@ -13078,7 +13379,7 @@
       <w:pPr>
         <w:pStyle w:val="Heading1"/>
       </w:pPr>
-      <w:bookmarkStart w:id="0" w:name="_Toc211097593"/>
+      <w:bookmarkStart w:id="0" w:name="_Toc231746409"/>
       <w:r>
         <w:lastRenderedPageBreak/>
         <w:t>Opdrachtbeschrijving</w:t>
@@ -13089,7 +13390,7 @@
       <w:pPr>
         <w:pStyle w:val="Heading2"/>
       </w:pPr>
-      <w:bookmarkStart w:id="1" w:name="_Toc211097594"/>
+      <w:bookmarkStart w:id="1" w:name="_Toc231746410"/>
       <w:r>
         <w:t>Horeca app</w:t>
       </w:r>
@@ -13126,7 +13427,7 @@
       <w:pPr>
         <w:pStyle w:val="Heading3"/>
       </w:pPr>
-      <w:bookmarkStart w:id="2" w:name="_Toc211097595"/>
+      <w:bookmarkStart w:id="2" w:name="_Toc231746411"/>
       <w:r>
         <w:t>M</w:t>
       </w:r>
@@ -13160,7 +13461,7 @@
       <w:pPr>
         <w:pStyle w:val="Heading3"/>
       </w:pPr>
-      <w:bookmarkStart w:id="3" w:name="_Toc211097596"/>
+      <w:bookmarkStart w:id="3" w:name="_Toc231746412"/>
       <w:r>
         <w:t>Huidige workflow</w:t>
       </w:r>
@@ -13234,7 +13535,7 @@
       <w:pPr>
         <w:pStyle w:val="Heading3"/>
       </w:pPr>
-      <w:bookmarkStart w:id="4" w:name="_Toc211097597"/>
+      <w:bookmarkStart w:id="4" w:name="_Toc231746413"/>
       <w:r>
         <w:t>Gewenste workflow</w:t>
       </w:r>
@@ -13296,7 +13597,7 @@
       <w:pPr>
         <w:pStyle w:val="Heading3"/>
       </w:pPr>
-      <w:bookmarkStart w:id="5" w:name="_Toc211097598"/>
+      <w:bookmarkStart w:id="5" w:name="_Toc231746414"/>
       <w:r>
         <w:t xml:space="preserve">Must </w:t>
       </w:r>
@@ -13589,7 +13890,7 @@
       <w:pPr>
         <w:pStyle w:val="Heading1"/>
       </w:pPr>
-      <w:bookmarkStart w:id="6" w:name="_Toc211097599"/>
+      <w:bookmarkStart w:id="6" w:name="_Toc231746415"/>
       <w:r>
         <w:lastRenderedPageBreak/>
         <w:t>Eisenanalyse</w:t>
@@ -13600,7 +13901,7 @@
       <w:pPr>
         <w:pStyle w:val="Heading2"/>
       </w:pPr>
-      <w:bookmarkStart w:id="7" w:name="_Toc211097600"/>
+      <w:bookmarkStart w:id="7" w:name="_Toc231746416"/>
       <w:r>
         <w:t>Functionele eisen</w:t>
       </w:r>
@@ -13613,7 +13914,7 @@
           <w:lang w:eastAsia="nl-BE"/>
         </w:rPr>
       </w:pPr>
-      <w:bookmarkStart w:id="8" w:name="_Toc211097601"/>
+      <w:bookmarkStart w:id="8" w:name="_Toc231746417"/>
       <w:proofErr w:type="spellStart"/>
       <w:r>
         <w:rPr>
@@ -13697,7 +13998,7 @@
         </w:rPr>
       </w:pPr>
       <w:bookmarkStart w:id="9" w:name="_Toc211097625"/>
-      <w:bookmarkStart w:id="10" w:name="_Toc211097648"/>
+      <w:bookmarkStart w:id="10" w:name="_Toc231746421"/>
       <w:r>
         <w:t xml:space="preserve">Figuur </w:t>
       </w:r>
@@ -13711,6 +14012,9 @@
         <w:fldChar w:fldCharType="separate"/>
       </w:r>
       <w:r>
+        <w:rPr>
+          <w:noProof/>
+        </w:rPr>
         <w:t>2</w:t>
       </w:r>
       <w:r>
@@ -13729,6 +14033,9 @@
         <w:fldChar w:fldCharType="separate"/>
       </w:r>
       <w:r>
+        <w:rPr>
+          <w:noProof/>
+        </w:rPr>
         <w:t>1</w:t>
       </w:r>
       <w:r>
@@ -13768,7 +14075,7 @@
           <w:lang w:val="en-US" w:eastAsia="nl-BE"/>
         </w:rPr>
       </w:pPr>
-      <w:bookmarkStart w:id="11" w:name="_Toc211097602"/>
+      <w:bookmarkStart w:id="11" w:name="_Toc231746418"/>
       <w:proofErr w:type="spellStart"/>
       <w:r>
         <w:rPr>
@@ -13846,7 +14153,7 @@
         <w:pStyle w:val="Caption"/>
       </w:pPr>
       <w:bookmarkStart w:id="12" w:name="_Toc211097626"/>
-      <w:bookmarkStart w:id="13" w:name="_Toc211097649"/>
+      <w:bookmarkStart w:id="13" w:name="_Toc231746422"/>
       <w:r>
         <w:t xml:space="preserve">Figuur </w:t>
       </w:r>
@@ -13860,6 +14167,9 @@
         <w:fldChar w:fldCharType="separate"/>
       </w:r>
       <w:r>
+        <w:rPr>
+          <w:noProof/>
+        </w:rPr>
         <w:t>2</w:t>
       </w:r>
       <w:r>
@@ -13878,6 +14188,9 @@
         <w:fldChar w:fldCharType="separate"/>
       </w:r>
       <w:r>
+        <w:rPr>
+          <w:noProof/>
+        </w:rPr>
         <w:t>2</w:t>
       </w:r>
       <w:r>
@@ -13911,7 +14224,7 @@
           <w:lang w:eastAsia="nl-BE"/>
         </w:rPr>
       </w:pPr>
-      <w:bookmarkStart w:id="14" w:name="_Toc211097603"/>
+      <w:bookmarkStart w:id="14" w:name="_Toc231746419"/>
       <w:proofErr w:type="spellStart"/>
       <w:r>
         <w:lastRenderedPageBreak/>
@@ -24279,6 +24592,7 @@
           <w:lang w:eastAsia="nl-BE"/>
         </w:rPr>
       </w:pPr>
+      <w:bookmarkStart w:id="15" w:name="_Toc231746420"/>
       <w:r>
         <w:rPr>
           <w:lang w:eastAsia="nl-BE"/>
@@ -24286,20 +24600,11 @@
         <w:lastRenderedPageBreak/>
         <w:t>Stijl prototypes</w:t>
       </w:r>
+      <w:bookmarkEnd w:id="15"/>
     </w:p>
     <w:p>
       <w:pPr>
-        <w:pStyle w:val="Heading2"/>
-      </w:pPr>
-      <w:r>
-        <w:t>Dranken scherm</w:t>
-      </w:r>
-    </w:p>
-    <w:p>
-      <w:pPr>
-        <w:rPr>
-          <w:lang w:val="nl-NL" w:eastAsia="nl-BE"/>
-        </w:rPr>
+        <w:keepNext/>
       </w:pPr>
       <w:r>
         <w:rPr>
@@ -24358,17 +24663,62 @@
     </w:p>
     <w:p>
       <w:pPr>
-        <w:pStyle w:val="Heading2"/>
+        <w:pStyle w:val="Caption"/>
+        <w:rPr>
+          <w:lang w:val="nl-NL" w:eastAsia="nl-BE"/>
+        </w:rPr>
       </w:pPr>
-      <w:r>
-        <w:t>Navigatie</w:t>
-      </w:r>
+      <w:bookmarkStart w:id="16" w:name="_Toc231746423"/>
+      <w:r>
+        <w:t xml:space="preserve">Figuur </w:t>
+      </w:r>
+      <w:r>
+        <w:fldChar w:fldCharType="begin"/>
+      </w:r>
+      <w:r>
+        <w:instrText xml:space="preserve"> STYLEREF 1 \s </w:instrText>
+      </w:r>
+      <w:r>
+        <w:fldChar w:fldCharType="separate"/>
+      </w:r>
+      <w:r>
+        <w:rPr>
+          <w:noProof/>
+        </w:rPr>
+        <w:t>3</w:t>
+      </w:r>
+      <w:r>
+        <w:fldChar w:fldCharType="end"/>
+      </w:r>
+      <w:r>
+        <w:t>.</w:t>
+      </w:r>
+      <w:r>
+        <w:fldChar w:fldCharType="begin"/>
+      </w:r>
+      <w:r>
+        <w:instrText xml:space="preserve"> SEQ Figuur \* ARABIC \s 1 </w:instrText>
+      </w:r>
+      <w:r>
+        <w:fldChar w:fldCharType="separate"/>
+      </w:r>
+      <w:r>
+        <w:rPr>
+          <w:noProof/>
+        </w:rPr>
+        <w:t>1</w:t>
+      </w:r>
+      <w:r>
+        <w:fldChar w:fldCharType="end"/>
+      </w:r>
+      <w:r>
+        <w:t xml:space="preserve"> Drankenscherm</w:t>
+      </w:r>
+      <w:bookmarkEnd w:id="16"/>
     </w:p>
     <w:p>
       <w:pPr>
-        <w:rPr>
-          <w:lang w:val="nl-NL" w:eastAsia="nl-BE"/>
-        </w:rPr>
+        <w:keepNext/>
       </w:pPr>
       <w:r>
         <w:rPr>
@@ -24427,17 +24777,62 @@
     </w:p>
     <w:p>
       <w:pPr>
-        <w:pStyle w:val="Heading2"/>
+        <w:pStyle w:val="Caption"/>
+        <w:rPr>
+          <w:lang w:val="nl-NL" w:eastAsia="nl-BE"/>
+        </w:rPr>
       </w:pPr>
-      <w:r>
-        <w:t>Bestellingen</w:t>
-      </w:r>
+      <w:bookmarkStart w:id="17" w:name="_Toc231746424"/>
+      <w:r>
+        <w:t xml:space="preserve">Figuur </w:t>
+      </w:r>
+      <w:r>
+        <w:fldChar w:fldCharType="begin"/>
+      </w:r>
+      <w:r>
+        <w:instrText xml:space="preserve"> STYLEREF 1 \s </w:instrText>
+      </w:r>
+      <w:r>
+        <w:fldChar w:fldCharType="separate"/>
+      </w:r>
+      <w:r>
+        <w:rPr>
+          <w:noProof/>
+        </w:rPr>
+        <w:t>3</w:t>
+      </w:r>
+      <w:r>
+        <w:fldChar w:fldCharType="end"/>
+      </w:r>
+      <w:r>
+        <w:t>.</w:t>
+      </w:r>
+      <w:r>
+        <w:fldChar w:fldCharType="begin"/>
+      </w:r>
+      <w:r>
+        <w:instrText xml:space="preserve"> SEQ Figuur \* ARABIC \s 1 </w:instrText>
+      </w:r>
+      <w:r>
+        <w:fldChar w:fldCharType="separate"/>
+      </w:r>
+      <w:r>
+        <w:rPr>
+          <w:noProof/>
+        </w:rPr>
+        <w:t>2</w:t>
+      </w:r>
+      <w:r>
+        <w:fldChar w:fldCharType="end"/>
+      </w:r>
+      <w:r>
+        <w:t xml:space="preserve"> Navigatie</w:t>
+      </w:r>
+      <w:bookmarkEnd w:id="17"/>
     </w:p>
     <w:p>
       <w:pPr>
-        <w:rPr>
-          <w:lang w:val="nl-NL" w:eastAsia="nl-BE"/>
-        </w:rPr>
+        <w:keepNext/>
       </w:pPr>
       <w:r>
         <w:rPr>
@@ -24496,6 +24891,61 @@
     </w:p>
     <w:p>
       <w:pPr>
+        <w:pStyle w:val="Caption"/>
+        <w:rPr>
+          <w:lang w:val="nl-NL" w:eastAsia="nl-BE"/>
+        </w:rPr>
+      </w:pPr>
+      <w:bookmarkStart w:id="18" w:name="_Toc231746425"/>
+      <w:r>
+        <w:t xml:space="preserve">Figuur </w:t>
+      </w:r>
+      <w:r>
+        <w:fldChar w:fldCharType="begin"/>
+      </w:r>
+      <w:r>
+        <w:instrText xml:space="preserve"> STYLEREF 1 \s </w:instrText>
+      </w:r>
+      <w:r>
+        <w:fldChar w:fldCharType="separate"/>
+      </w:r>
+      <w:r>
+        <w:rPr>
+          <w:noProof/>
+        </w:rPr>
+        <w:t>3</w:t>
+      </w:r>
+      <w:r>
+        <w:fldChar w:fldCharType="end"/>
+      </w:r>
+      <w:r>
+        <w:t>.</w:t>
+      </w:r>
+      <w:r>
+        <w:fldChar w:fldCharType="begin"/>
+      </w:r>
+      <w:r>
+        <w:instrText xml:space="preserve"> SEQ Figuur \* ARABIC \s 1 </w:instrText>
+      </w:r>
+      <w:r>
+        <w:fldChar w:fldCharType="separate"/>
+      </w:r>
+      <w:r>
+        <w:rPr>
+          <w:noProof/>
+        </w:rPr>
+        <w:t>3</w:t>
+      </w:r>
+      <w:r>
+        <w:fldChar w:fldCharType="end"/>
+      </w:r>
+      <w:r>
+        <w:t xml:space="preserve"> Bestellingenscherm</w:t>
+      </w:r>
+      <w:bookmarkEnd w:id="18"/>
+    </w:p>
+    <w:p>
+      <w:pPr>
         <w:rPr>
           <w:lang w:eastAsia="nl-BE"/>
         </w:rPr>
@@ -24504,13 +24954,15 @@
         <w:rPr>
           <w:lang w:eastAsia="nl-BE"/>
         </w:rPr>
-        <w:lastRenderedPageBreak/>
         <w:br w:type="page"/>
       </w:r>
     </w:p>
     <w:p>
       <w:pPr>
         <w:pStyle w:val="TOCHeading"/>
+        <w:rPr>
+          <w:noProof/>
+        </w:rPr>
       </w:pPr>
       <w:r>
         <w:rPr>
@@ -24543,56 +24995,65 @@
         <w:pStyle w:val="TableofFigures"/>
         <w:rPr>
           <w:rFonts w:asciiTheme="minorHAnsi" w:eastAsiaTheme="minorEastAsia" w:hAnsiTheme="minorHAnsi" w:cstheme="minorBidi"/>
+          <w:noProof/>
           <w:color w:val="auto"/>
           <w:sz w:val="24"/>
           <w:szCs w:val="24"/>
           <w:lang w:val="en-BE" w:eastAsia="en-BE"/>
         </w:rPr>
       </w:pPr>
-      <w:hyperlink w:anchor="_Toc211097648" w:history="1">
+      <w:hyperlink w:anchor="_Toc231746421" w:history="1">
         <w:r>
           <w:rPr>
             <w:rStyle w:val="Hyperlink"/>
+            <w:noProof/>
           </w:rPr>
           <w:t>Figuur 2.1 Use Case Diagram</w:t>
         </w:r>
         <w:r>
           <w:rPr>
-            <w:rStyle w:val="Hyperlink"/>
+            <w:noProof/>
+            <w:webHidden/>
           </w:rPr>
           <w:tab/>
         </w:r>
         <w:r>
           <w:rPr>
+            <w:noProof/>
             <w:webHidden/>
           </w:rPr>
           <w:fldChar w:fldCharType="begin"/>
         </w:r>
         <w:r>
           <w:rPr>
+            <w:noProof/>
             <w:webHidden/>
           </w:rPr>
-          <w:instrText xml:space="preserve"> PAGEREF _Toc211097648 \h </w:instrText>
+          <w:instrText xml:space="preserve"> PAGEREF _Toc231746421 \h </w:instrText>
         </w:r>
         <w:r>
           <w:rPr>
+            <w:noProof/>
             <w:webHidden/>
           </w:rPr>
         </w:r>
         <w:r>
           <w:rPr>
+            <w:noProof/>
             <w:webHidden/>
           </w:rPr>
           <w:fldChar w:fldCharType="separate"/>
         </w:r>
         <w:r>
           <w:rPr>
+            <w:noProof/>
             <w:webHidden/>
           </w:rPr>
           <w:t>4</w:t>
         </w:r>
         <w:r>
           <w:rPr>
+            <w:noProof/>
             <w:webHidden/>
           </w:rPr>
           <w:fldChar w:fldCharType="end"/>
@@ -24604,56 +25065,275 @@
         <w:pStyle w:val="TableofFigures"/>
         <w:rPr>
           <w:rFonts w:asciiTheme="minorHAnsi" w:eastAsiaTheme="minorEastAsia" w:hAnsiTheme="minorHAnsi" w:cstheme="minorBidi"/>
+          <w:noProof/>
           <w:color w:val="auto"/>
           <w:sz w:val="24"/>
           <w:szCs w:val="24"/>
           <w:lang w:val="en-BE" w:eastAsia="en-BE"/>
         </w:rPr>
       </w:pPr>
-      <w:hyperlink w:anchor="_Toc211097649" w:history="1">
+      <w:hyperlink w:anchor="_Toc231746422" w:history="1">
         <w:r>
           <w:rPr>
             <w:rStyle w:val="Hyperlink"/>
+            <w:noProof/>
           </w:rPr>
           <w:t>Figuur 2.2 Datamode</w:t>
         </w:r>
         <w:r>
           <w:rPr>
+            <w:noProof/>
             <w:webHidden/>
           </w:rPr>
           <w:tab/>
         </w:r>
         <w:r>
           <w:rPr>
+            <w:noProof/>
             <w:webHidden/>
           </w:rPr>
           <w:fldChar w:fldCharType="begin"/>
         </w:r>
         <w:r>
           <w:rPr>
+            <w:noProof/>
             <w:webHidden/>
           </w:rPr>
-          <w:instrText xml:space="preserve"> PAGEREF _Toc211097649 \h </w:instrText>
+          <w:instrText xml:space="preserve"> PAGEREF _Toc231746422 \h </w:instrText>
         </w:r>
         <w:r>
           <w:rPr>
+            <w:noProof/>
             <w:webHidden/>
           </w:rPr>
         </w:r>
         <w:r>
           <w:rPr>
+            <w:noProof/>
             <w:webHidden/>
           </w:rPr>
           <w:fldChar w:fldCharType="separate"/>
         </w:r>
         <w:r>
           <w:rPr>
+            <w:noProof/>
             <w:webHidden/>
           </w:rPr>
           <w:t>5</w:t>
         </w:r>
         <w:r>
           <w:rPr>
+            <w:noProof/>
+            <w:webHidden/>
+          </w:rPr>
+          <w:fldChar w:fldCharType="end"/>
+        </w:r>
+      </w:hyperlink>
+    </w:p>
+    <w:p>
+      <w:pPr>
+        <w:pStyle w:val="TableofFigures"/>
+        <w:rPr>
+          <w:rFonts w:asciiTheme="minorHAnsi" w:eastAsiaTheme="minorEastAsia" w:hAnsiTheme="minorHAnsi" w:cstheme="minorBidi"/>
+          <w:noProof/>
+          <w:color w:val="auto"/>
+          <w:sz w:val="24"/>
+          <w:szCs w:val="24"/>
+          <w:lang w:val="en-BE" w:eastAsia="en-BE"/>
+        </w:rPr>
+      </w:pPr>
+      <w:hyperlink w:anchor="_Toc231746423" w:history="1">
+        <w:r>
+          <w:rPr>
+            <w:rStyle w:val="Hyperlink"/>
+            <w:noProof/>
+          </w:rPr>
+          <w:t>Figuur 3.1 Drankenscherm</w:t>
+        </w:r>
+        <w:r>
+          <w:rPr>
+            <w:noProof/>
+            <w:webHidden/>
+          </w:rPr>
+          <w:tab/>
+        </w:r>
+        <w:r>
+          <w:rPr>
+            <w:noProof/>
+            <w:webHidden/>
+          </w:rPr>
+          <w:fldChar w:fldCharType="begin"/>
+        </w:r>
+        <w:r>
+          <w:rPr>
+            <w:noProof/>
+            <w:webHidden/>
+          </w:rPr>
+          <w:instrText xml:space="preserve"> PAGEREF _Toc231746423 \h </w:instrText>
+        </w:r>
+        <w:r>
+          <w:rPr>
+            <w:noProof/>
+            <w:webHidden/>
+          </w:rPr>
+        </w:r>
+        <w:r>
+          <w:rPr>
+            <w:noProof/>
+            <w:webHidden/>
+          </w:rPr>
+          <w:fldChar w:fldCharType="separate"/>
+        </w:r>
+        <w:r>
+          <w:rPr>
+            <w:noProof/>
+            <w:webHidden/>
+          </w:rPr>
+          <w:t>11</w:t>
+        </w:r>
+        <w:r>
+          <w:rPr>
+            <w:noProof/>
+            <w:webHidden/>
+          </w:rPr>
+          <w:fldChar w:fldCharType="end"/>
+        </w:r>
+      </w:hyperlink>
+    </w:p>
+    <w:p>
+      <w:pPr>
+        <w:pStyle w:val="TableofFigures"/>
+        <w:rPr>
+          <w:rFonts w:asciiTheme="minorHAnsi" w:eastAsiaTheme="minorEastAsia" w:hAnsiTheme="minorHAnsi" w:cstheme="minorBidi"/>
+          <w:noProof/>
+          <w:color w:val="auto"/>
+          <w:sz w:val="24"/>
+          <w:szCs w:val="24"/>
+          <w:lang w:val="en-BE" w:eastAsia="en-BE"/>
+        </w:rPr>
+      </w:pPr>
+      <w:hyperlink w:anchor="_Toc231746424" w:history="1">
+        <w:r>
+          <w:rPr>
+            <w:rStyle w:val="Hyperlink"/>
+            <w:noProof/>
+          </w:rPr>
+          <w:t>Figuur 3.2 Navigatie</w:t>
+        </w:r>
+        <w:r>
+          <w:rPr>
+            <w:noProof/>
+            <w:webHidden/>
+          </w:rPr>
+          <w:tab/>
+        </w:r>
+        <w:r>
+          <w:rPr>
+            <w:noProof/>
+            <w:webHidden/>
+          </w:rPr>
+          <w:fldChar w:fldCharType="begin"/>
+        </w:r>
+        <w:r>
+          <w:rPr>
+            <w:noProof/>
+            <w:webHidden/>
+          </w:rPr>
+          <w:instrText xml:space="preserve"> PAGEREF _Toc231746424 \h </w:instrText>
+        </w:r>
+        <w:r>
+          <w:rPr>
+            <w:noProof/>
+            <w:webHidden/>
+          </w:rPr>
+        </w:r>
+        <w:r>
+          <w:rPr>
+            <w:noProof/>
+            <w:webHidden/>
+          </w:rPr>
+          <w:fldChar w:fldCharType="separate"/>
+        </w:r>
+        <w:r>
+          <w:rPr>
+            <w:noProof/>
+            <w:webHidden/>
+          </w:rPr>
+          <w:t>11</w:t>
+        </w:r>
+        <w:r>
+          <w:rPr>
+            <w:noProof/>
+            <w:webHidden/>
+          </w:rPr>
+          <w:fldChar w:fldCharType="end"/>
+        </w:r>
+      </w:hyperlink>
+    </w:p>
+    <w:p>
+      <w:pPr>
+        <w:pStyle w:val="TableofFigures"/>
+        <w:rPr>
+          <w:rFonts w:asciiTheme="minorHAnsi" w:eastAsiaTheme="minorEastAsia" w:hAnsiTheme="minorHAnsi" w:cstheme="minorBidi"/>
+          <w:noProof/>
+          <w:color w:val="auto"/>
+          <w:sz w:val="24"/>
+          <w:szCs w:val="24"/>
+          <w:lang w:val="en-BE" w:eastAsia="en-BE"/>
+        </w:rPr>
+      </w:pPr>
+      <w:hyperlink w:anchor="_Toc231746425" w:history="1">
+        <w:r>
+          <w:rPr>
+            <w:rStyle w:val="Hyperlink"/>
+            <w:noProof/>
+          </w:rPr>
+          <w:t>Figuur 3.3 Bestellingenscherm</w:t>
+        </w:r>
+        <w:r>
+          <w:rPr>
+            <w:noProof/>
+            <w:webHidden/>
+          </w:rPr>
+          <w:tab/>
+        </w:r>
+        <w:r>
+          <w:rPr>
+            <w:noProof/>
+            <w:webHidden/>
+          </w:rPr>
+          <w:fldChar w:fldCharType="begin"/>
+        </w:r>
+        <w:r>
+          <w:rPr>
+            <w:noProof/>
+            <w:webHidden/>
+          </w:rPr>
+          <w:instrText xml:space="preserve"> PAGEREF _Toc231746425 \h </w:instrText>
+        </w:r>
+        <w:r>
+          <w:rPr>
+            <w:noProof/>
+            <w:webHidden/>
+          </w:rPr>
+        </w:r>
+        <w:r>
+          <w:rPr>
+            <w:noProof/>
+            <w:webHidden/>
+          </w:rPr>
+          <w:fldChar w:fldCharType="separate"/>
+        </w:r>
+        <w:r>
+          <w:rPr>
+            <w:noProof/>
+            <w:webHidden/>
+          </w:rPr>
+          <w:t>11</w:t>
+        </w:r>
+        <w:r>
+          <w:rPr>
+            <w:noProof/>
             <w:webHidden/>
           </w:rPr>
           <w:fldChar w:fldCharType="end"/>

</xml_diff>